<commit_message>
docs: translate docs to English, move open questions out of the repo, add tools README
</commit_message>
<xml_diff>
--- a/docs/word/Session-01-MVP-Scope-GroupC.docx
+++ b/docs/word/Session-01-MVP-Scope-GroupC.docx
@@ -778,7 +778,7 @@
               </w:rPr>
             </w:pPr>
             <w:r>
-              <w:t>• Screens: System Design v2.0, sheet 5. Screen List (docs/screen-list.md); 20 priority screens mocked and specified in screens/.</w:t>
+              <w:t>• Screens: System Design v2.0, sheet 5. Screen List (docs/screen-list.md); 20 priority screens mocked and specified in docs/screens/.</w:t>
             </w:r>
           </w:p>
         </w:tc>
@@ -3309,7 +3309,7 @@
               </w:rPr>
             </w:pPr>
             <w:r>
-              <w:t>Clarify the blocking questions with VFDA (scoring weights, Verified criteria, rule sign-off, calendar vs working days, notice mandate)</w:t>
+              <w:t>Clarify the open points with VFDA (tracked outside this repository)</w:t>
             </w:r>
           </w:p>
         </w:tc>

</xml_diff>

<commit_message>
docs: add M10 spec, 21 screen specs, PRD v3; restore open questions; resolve data lifecycle
</commit_message>
<xml_diff>
--- a/docs/word/Session-01-MVP-Scope-GroupC.docx
+++ b/docs/word/Session-01-MVP-Scope-GroupC.docx
@@ -3193,7 +3193,7 @@
               </w:rPr>
             </w:pPr>
             <w:r>
-              <w:t>8 module Spec Documents (Step 5): SYS, M0, M1, M2, M3, M4, M5, M7</w:t>
+              <w:t>9 module Spec Documents (Step 5): SYS, M0, M1, M2, M3, M4, M5, M7, M10</w:t>
             </w:r>
           </w:p>
         </w:tc>
@@ -3259,7 +3259,7 @@
               </w:rPr>
             </w:pPr>
             <w:r>
-              <w:t>Draft — ready for Client review</w:t>
+              <w:t>Done — M10 added 30/09/2026</w:t>
             </w:r>
           </w:p>
         </w:tc>
@@ -3309,7 +3309,7 @@
               </w:rPr>
             </w:pPr>
             <w:r>
-              <w:t>Clarify the open points with VFDA (tracked outside this repository)</w:t>
+              <w:t>Clarify the open questions with VFDA (section 10 of each Spec Document)</w:t>
             </w:r>
           </w:p>
         </w:tc>
@@ -3425,7 +3425,7 @@
               </w:rPr>
             </w:pPr>
             <w:r>
-              <w:t>Mockups and Screen Specs for the admin screens SC-35, SC-36, SC-37</w:t>
+              <w:t>Mockups and Screen Specs for the other 21 MVP screens, incl. admin screens SC-34 to SC-41</w:t>
             </w:r>
           </w:p>
         </w:tc>
@@ -3491,7 +3491,7 @@
               </w:rPr>
             </w:pPr>
             <w:r>
-              <w:t>Not started</w:t>
+              <w:t>Done 30/09/2026</w:t>
             </w:r>
           </w:p>
         </w:tc>
@@ -3541,7 +3541,7 @@
               </w:rPr>
             </w:pPr>
             <w:r>
-              <w:t>Development environment: GitHub, Supabase, Vercel, Claude Code</w:t>
+              <w:t>Development environment (Session 6): GitHub repository, Spec Kit, AI agents</w:t>
             </w:r>
           </w:p>
         </w:tc>
@@ -3607,7 +3607,7 @@
               </w:rPr>
             </w:pPr>
             <w:r>
-              <w:t>Not started</w:t>
+              <w:t>In progress</w:t>
             </w:r>
           </w:p>
         </w:tc>

</xml_diff>

<commit_message>
chore: fix line endings on Windows
</commit_message>
<xml_diff>
--- a/docs/word/Session-01-MVP-Scope-GroupC.docx
+++ b/docs/word/Session-01-MVP-Scope-GroupC.docx
@@ -3193,7 +3193,7 @@
               </w:rPr>
             </w:pPr>
             <w:r>
-              <w:t>8 module Spec Documents (Step 5): SYS, M0, M1, M2, M3, M4, M5, M7</w:t>
+              <w:t>9 module Spec Documents (Step 5): SYS, M0, M1, M2, M3, M4, M5, M7, M10</w:t>
             </w:r>
           </w:p>
         </w:tc>
@@ -3259,7 +3259,7 @@
               </w:rPr>
             </w:pPr>
             <w:r>
-              <w:t>Draft — ready for Client review</w:t>
+              <w:t>Done — M10 added 30/09/2026</w:t>
             </w:r>
           </w:p>
         </w:tc>
@@ -3309,7 +3309,7 @@
               </w:rPr>
             </w:pPr>
             <w:r>
-              <w:t>Clarify the open points with VFDA (tracked outside this repository)</w:t>
+              <w:t>Clarify the open questions with VFDA (section 10 of each Spec Document)</w:t>
             </w:r>
           </w:p>
         </w:tc>
@@ -3425,7 +3425,7 @@
               </w:rPr>
             </w:pPr>
             <w:r>
-              <w:t>Mockups and Screen Specs for the admin screens SC-35, SC-36, SC-37</w:t>
+              <w:t>Mockups and Screen Specs for the other 21 MVP screens, incl. admin screens SC-34 to SC-41</w:t>
             </w:r>
           </w:p>
         </w:tc>
@@ -3491,7 +3491,7 @@
               </w:rPr>
             </w:pPr>
             <w:r>
-              <w:t>Not started</w:t>
+              <w:t>Done 30/09/2026</w:t>
             </w:r>
           </w:p>
         </w:tc>
@@ -3541,7 +3541,7 @@
               </w:rPr>
             </w:pPr>
             <w:r>
-              <w:t>Development environment: GitHub, Supabase, Vercel, Claude Code</w:t>
+              <w:t>Development environment (Session 6): GitHub repository, Spec Kit, AI agents</w:t>
             </w:r>
           </w:p>
         </w:tc>
@@ -3607,7 +3607,7 @@
               </w:rPr>
             </w:pPr>
             <w:r>
-              <w:t>Not started</w:t>
+              <w:t>In progress</w:t>
             </w:r>
           </w:p>
         </w:tc>

</xml_diff>